<commit_message>
replaced the original Artemis Financial Practices for Secure Software Report with updated version
</commit_message>
<xml_diff>
--- a/Artemis Financial Practices for Secure Software Report - Arden Boykin.docx
+++ b/Artemis Financial Practices for Secure Software Report - Arden Boykin.docx
@@ -242,8 +242,8 @@
         <w:br w:type="page"/>
       </w:r>
     </w:p>
-    <w:bookmarkStart w:id="0" w:name="_Toc1367610133" w:displacedByCustomXml="next"/>
-    <w:bookmarkStart w:id="1" w:name="_Toc1517617528" w:displacedByCustomXml="next"/>
+    <w:bookmarkStart w:id="0" w:name="_Toc1517617528" w:displacedByCustomXml="next"/>
+    <w:bookmarkStart w:id="1" w:name="_Toc1367610133" w:displacedByCustomXml="next"/>
     <w:sdt>
       <w:sdtPr>
         <w:rPr>
@@ -893,7 +893,7 @@
                 <w:sz w:val="24"/>
                 <w:szCs w:val="24"/>
               </w:rPr>
-              <w:t>4</w:t>
+              <w:t>5</w:t>
             </w:r>
             <w:r>
               <w:rPr>
@@ -977,7 +977,7 @@
                 <w:sz w:val="24"/>
                 <w:szCs w:val="24"/>
               </w:rPr>
-              <w:t>4</w:t>
+              <w:t>5</w:t>
             </w:r>
             <w:r>
               <w:rPr>
@@ -1061,7 +1061,7 @@
                 <w:sz w:val="24"/>
                 <w:szCs w:val="24"/>
               </w:rPr>
-              <w:t>4</w:t>
+              <w:t>7</w:t>
             </w:r>
             <w:r>
               <w:rPr>
@@ -1145,7 +1145,7 @@
                 <w:sz w:val="24"/>
                 <w:szCs w:val="24"/>
               </w:rPr>
-              <w:t>4</w:t>
+              <w:t>8</w:t>
             </w:r>
             <w:r>
               <w:rPr>
@@ -1229,7 +1229,7 @@
                 <w:sz w:val="24"/>
                 <w:szCs w:val="24"/>
               </w:rPr>
-              <w:t>4</w:t>
+              <w:t>9</w:t>
             </w:r>
             <w:r>
               <w:rPr>
@@ -1313,7 +1313,7 @@
                 <w:sz w:val="24"/>
                 <w:szCs w:val="24"/>
               </w:rPr>
-              <w:t>4</w:t>
+              <w:t>9</w:t>
             </w:r>
             <w:r>
               <w:rPr>
@@ -3120,7 +3120,7 @@
         </w:rPr>
         <w:lastRenderedPageBreak/>
         <w:drawing>
-          <wp:inline distT="0" distB="0" distL="0" distR="0" wp14:anchorId="689FECA6" wp14:editId="207A09F3">
+          <wp:inline distT="0" distB="0" distL="0" distR="0" wp14:anchorId="689FECA6" wp14:editId="575C6070">
             <wp:extent cx="5943600" cy="3404235"/>
             <wp:effectExtent l="0" t="0" r="0" b="5715"/>
             <wp:docPr id="1396632832" name="Picture 16"/>
@@ -7500,6 +7500,34 @@
 </file>
 
 <file path=customXml/item1.xml><?xml version="1.0" encoding="utf-8"?>
+<b:Sources xmlns:b="http://schemas.openxmlformats.org/officeDocument/2006/bibliography" xmlns="http://schemas.openxmlformats.org/officeDocument/2006/bibliography" SelectedStyle="/APASixthEditionOfficeOnline.xsl" StyleName="APA" Version="6"/>
+</file>
+
+<file path=customXml/item2.xml><?xml version="1.0" encoding="utf-8"?>
+<p:properties xmlns:p="http://schemas.microsoft.com/office/2006/metadata/properties" xmlns:xsi="http://www.w3.org/2001/XMLSchema-instance" xmlns:pc="http://schemas.microsoft.com/office/infopath/2007/PartnerControls">
+  <documentManagement>
+    <Comments xmlns="c534d78a-cb69-4aca-a069-043e1704d47b" xsi:nil="true"/>
+    <SharedWithUsers xmlns="40cc8b17-6277-40d3-adb4-53037ef9c179">
+      <UserInfo>
+        <DisplayName/>
+        <AccountId xsi:nil="true"/>
+        <AccountType/>
+      </UserInfo>
+    </SharedWithUsers>
+  </documentManagement>
+</p:properties>
+</file>
+
+<file path=customXml/item3.xml><?xml version="1.0" encoding="utf-8"?>
+<?mso-contentType ?>
+<FormTemplates xmlns="http://schemas.microsoft.com/sharepoint/v3/contenttype/forms">
+  <Display>DocumentLibraryForm</Display>
+  <Edit>DocumentLibraryForm</Edit>
+  <New>DocumentLibraryForm</New>
+</FormTemplates>
+</file>
+
+<file path=customXml/item4.xml><?xml version="1.0" encoding="utf-8"?>
 <ct:contentTypeSchema xmlns:ct="http://schemas.microsoft.com/office/2006/metadata/contentType" xmlns:ma="http://schemas.microsoft.com/office/2006/metadata/properties/metaAttributes" ct:_="" ma:_="" ma:contentTypeName="Document" ma:contentTypeID="0x010100F5CC0A6DD1FA224496921034181E8D3A" ma:contentTypeVersion="14" ma:contentTypeDescription="Create a new document." ma:contentTypeScope="" ma:versionID="ff6a6df06ef94ff418f3c8b370b904e6">
   <xsd:schema xmlns:xsd="http://www.w3.org/2001/XMLSchema" xmlns:xs="http://www.w3.org/2001/XMLSchema" xmlns:p="http://schemas.microsoft.com/office/2006/metadata/properties" xmlns:ns2="c534d78a-cb69-4aca-a069-043e1704d47b" xmlns:ns3="40cc8b17-6277-40d3-adb4-53037ef9c179" targetNamespace="http://schemas.microsoft.com/office/2006/metadata/properties" ma:root="true" ma:fieldsID="b2980321f430c580e134f30fce888d45" ns2:_="" ns3:_="">
     <xsd:import namespace="c534d78a-cb69-4aca-a069-043e1704d47b"/>
@@ -7724,35 +7752,34 @@
 </ct:contentTypeSchema>
 </file>
 
-<file path=customXml/item2.xml><?xml version="1.0" encoding="utf-8"?>
-<?mso-contentType ?>
-<FormTemplates xmlns="http://schemas.microsoft.com/sharepoint/v3/contenttype/forms">
-  <Display>DocumentLibraryForm</Display>
-  <Edit>DocumentLibraryForm</Edit>
-  <New>DocumentLibraryForm</New>
-</FormTemplates>
+<file path=customXml/itemProps1.xml><?xml version="1.0" encoding="utf-8"?>
+<ds:datastoreItem xmlns:ds="http://schemas.openxmlformats.org/officeDocument/2006/customXml" ds:itemID="{ADC17017-D038-47B4-883E-8E6EBCDB8FF6}">
+  <ds:schemaRefs>
+    <ds:schemaRef ds:uri="http://schemas.openxmlformats.org/officeDocument/2006/bibliography"/>
+  </ds:schemaRefs>
+</ds:datastoreItem>
 </file>
 
-<file path=customXml/item3.xml><?xml version="1.0" encoding="utf-8"?>
-<p:properties xmlns:p="http://schemas.microsoft.com/office/2006/metadata/properties" xmlns:xsi="http://www.w3.org/2001/XMLSchema-instance" xmlns:pc="http://schemas.microsoft.com/office/infopath/2007/PartnerControls">
-  <documentManagement>
-    <Comments xmlns="c534d78a-cb69-4aca-a069-043e1704d47b" xsi:nil="true"/>
-    <SharedWithUsers xmlns="40cc8b17-6277-40d3-adb4-53037ef9c179">
-      <UserInfo>
-        <DisplayName/>
-        <AccountId xsi:nil="true"/>
-        <AccountType/>
-      </UserInfo>
-    </SharedWithUsers>
-  </documentManagement>
-</p:properties>
+<file path=customXml/itemProps2.xml><?xml version="1.0" encoding="utf-8"?>
+<ds:datastoreItem xmlns:ds="http://schemas.openxmlformats.org/officeDocument/2006/customXml" ds:itemID="{3C31B74E-B801-4B52-B7BA-EA9BE36F272F}">
+  <ds:schemaRefs>
+    <ds:schemaRef ds:uri="http://schemas.microsoft.com/office/2006/metadata/properties"/>
+    <ds:schemaRef ds:uri="http://schemas.microsoft.com/office/infopath/2007/PartnerControls"/>
+    <ds:schemaRef ds:uri="c534d78a-cb69-4aca-a069-043e1704d47b"/>
+    <ds:schemaRef ds:uri="40cc8b17-6277-40d3-adb4-53037ef9c179"/>
+  </ds:schemaRefs>
+</ds:datastoreItem>
 </file>
 
-<file path=customXml/item4.xml><?xml version="1.0" encoding="utf-8"?>
-<b:Sources xmlns:b="http://schemas.openxmlformats.org/officeDocument/2006/bibliography" xmlns="http://schemas.openxmlformats.org/officeDocument/2006/bibliography" SelectedStyle="/APASixthEditionOfficeOnline.xsl" StyleName="APA" Version="6"/>
+<file path=customXml/itemProps3.xml><?xml version="1.0" encoding="utf-8"?>
+<ds:datastoreItem xmlns:ds="http://schemas.openxmlformats.org/officeDocument/2006/customXml" ds:itemID="{BDD9A1F8-243E-4DEE-9219-712EC0DB252F}">
+  <ds:schemaRefs>
+    <ds:schemaRef ds:uri="http://schemas.microsoft.com/sharepoint/v3/contenttype/forms"/>
+  </ds:schemaRefs>
+</ds:datastoreItem>
 </file>
 
-<file path=customXml/itemProps1.xml><?xml version="1.0" encoding="utf-8"?>
+<file path=customXml/itemProps4.xml><?xml version="1.0" encoding="utf-8"?>
 <ds:datastoreItem xmlns:ds="http://schemas.openxmlformats.org/officeDocument/2006/customXml" ds:itemID="{7969A40B-FE12-4AEB-B998-3DC7F9AF79FD}">
   <ds:schemaRefs>
     <ds:schemaRef ds:uri="http://schemas.microsoft.com/office/2006/metadata/contentType"/>
@@ -7769,31 +7796,4 @@
     <ds:schemaRef ds:uri="http://schemas.microsoft.com/internal/obd"/>
   </ds:schemaRefs>
 </ds:datastoreItem>
-</file>
-
-<file path=customXml/itemProps2.xml><?xml version="1.0" encoding="utf-8"?>
-<ds:datastoreItem xmlns:ds="http://schemas.openxmlformats.org/officeDocument/2006/customXml" ds:itemID="{BDD9A1F8-243E-4DEE-9219-712EC0DB252F}">
-  <ds:schemaRefs>
-    <ds:schemaRef ds:uri="http://schemas.microsoft.com/sharepoint/v3/contenttype/forms"/>
-  </ds:schemaRefs>
-</ds:datastoreItem>
-</file>
-
-<file path=customXml/itemProps3.xml><?xml version="1.0" encoding="utf-8"?>
-<ds:datastoreItem xmlns:ds="http://schemas.openxmlformats.org/officeDocument/2006/customXml" ds:itemID="{3C31B74E-B801-4B52-B7BA-EA9BE36F272F}">
-  <ds:schemaRefs>
-    <ds:schemaRef ds:uri="http://schemas.microsoft.com/office/2006/metadata/properties"/>
-    <ds:schemaRef ds:uri="http://schemas.microsoft.com/office/infopath/2007/PartnerControls"/>
-    <ds:schemaRef ds:uri="c534d78a-cb69-4aca-a069-043e1704d47b"/>
-    <ds:schemaRef ds:uri="40cc8b17-6277-40d3-adb4-53037ef9c179"/>
-  </ds:schemaRefs>
-</ds:datastoreItem>
-</file>
-
-<file path=customXml/itemProps4.xml><?xml version="1.0" encoding="utf-8"?>
-<ds:datastoreItem xmlns:ds="http://schemas.openxmlformats.org/officeDocument/2006/customXml" ds:itemID="{ADC17017-D038-47B4-883E-8E6EBCDB8FF6}">
-  <ds:schemaRefs>
-    <ds:schemaRef ds:uri="http://schemas.openxmlformats.org/officeDocument/2006/bibliography"/>
-  </ds:schemaRefs>
-</ds:datastoreItem>
 </file>
</xml_diff>